<commit_message>
commit inicial: subida de la primera version de la presentacion
</commit_message>
<xml_diff>
--- a/actividad 1 acuña_merged.docx
+++ b/actividad 1 acuña_merged.docx
@@ -621,7 +621,7 @@
           </mc:Choice>
           <mc:Fallback>
             <w:pict>
-              <v:group w14:anchorId="364C93CA" id="Group 1" o:spid="_x0000_s1026" style="position:absolute;margin-left:2.3pt;margin-top:0;width:592.85pt;height:839.55pt;z-index:-16369152;mso-wrap-distance-left:0;mso-wrap-distance-right:0;mso-position-horizontal-relative:page;mso-position-vertical-relative:page" coordsize="75291,106622" o:gfxdata="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">
+              <v:group w14:anchorId="1ACCB7E5" id="Group 1" o:spid="_x0000_s1026" style="position:absolute;margin-left:2.3pt;margin-top:0;width:592.85pt;height:839.55pt;z-index:-16369152;mso-wrap-distance-left:0;mso-wrap-distance-right:0;mso-position-horizontal-relative:page;mso-position-vertical-relative:page" coordsize="75291,106622" o:gfxdata="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">
                 <v:shapetype id="_x0000_t75" coordsize="21600,21600" o:spt="75" o:preferrelative="t" path="m@4@5l@4@11@9@11@9@5xe" filled="f" stroked="f">
                   <v:stroke joinstyle="miter"/>
                   <v:formulas>
@@ -5864,6 +5864,7 @@
                 <w:b/>
                 <w:bCs/>
               </w:rPr>
+              <w:lastRenderedPageBreak/>
               <w:t>Rol en el patrón</w:t>
             </w:r>
           </w:p>
@@ -5940,7 +5941,6 @@
               <w:rPr>
                 <w:rFonts w:ascii="Century Gothic" w:hAnsi="Century Gothic"/>
               </w:rPr>
-              <w:lastRenderedPageBreak/>
               <w:t>Sujeto</w:t>
             </w:r>
           </w:p>
@@ -11286,8 +11286,582 @@
         </w:rPr>
       </w:pPr>
     </w:p>
+    <w:p>
+      <w:pPr>
+        <w:pStyle w:val="Ttulo1"/>
+        <w:tabs>
+          <w:tab w:val="left" w:pos="1014"/>
+        </w:tabs>
+        <w:spacing w:before="318"/>
+        <w:ind w:firstLine="0"/>
+        <w:rPr>
+          <w:rFonts w:ascii="Century Gothic" w:hAnsi="Century Gothic"/>
+          <w:sz w:val="22"/>
+          <w:szCs w:val="32"/>
+        </w:rPr>
+      </w:pPr>
+      <w:r>
+        <w:rPr>
+          <w:rFonts w:ascii="Century Gothic" w:hAnsi="Century Gothic"/>
+          <w:sz w:val="22"/>
+          <w:szCs w:val="32"/>
+        </w:rPr>
+        <w:t>GitHub</w:t>
+      </w:r>
+    </w:p>
+    <w:p>
+      <w:pPr>
+        <w:pStyle w:val="Ttulo1"/>
+        <w:tabs>
+          <w:tab w:val="left" w:pos="1014"/>
+        </w:tabs>
+        <w:spacing w:before="318"/>
+        <w:ind w:firstLine="0"/>
+        <w:rPr>
+          <w:rFonts w:ascii="Century Gothic" w:hAnsi="Century Gothic"/>
+          <w:sz w:val="22"/>
+          <w:szCs w:val="32"/>
+        </w:rPr>
+      </w:pPr>
+      <w:r>
+        <w:rPr>
+          <w:noProof/>
+        </w:rPr>
+        <w:drawing>
+          <wp:inline distT="0" distB="0" distL="0" distR="0" wp14:anchorId="05ECA9AD" wp14:editId="57C04A8F">
+            <wp:extent cx="5985256" cy="3466768"/>
+            <wp:effectExtent l="0" t="0" r="0" b="0"/>
+            <wp:docPr id="35" name="Imagen 35"/>
+            <wp:cNvGraphicFramePr>
+              <a:graphicFrameLocks xmlns:a="http://schemas.openxmlformats.org/drawingml/2006/main" noChangeAspect="1"/>
+            </wp:cNvGraphicFramePr>
+            <a:graphic xmlns:a="http://schemas.openxmlformats.org/drawingml/2006/main">
+              <a:graphicData uri="http://schemas.openxmlformats.org/drawingml/2006/picture">
+                <pic:pic xmlns:pic="http://schemas.openxmlformats.org/drawingml/2006/picture">
+                  <pic:nvPicPr>
+                    <pic:cNvPr id="1" name=""/>
+                    <pic:cNvPicPr/>
+                  </pic:nvPicPr>
+                  <pic:blipFill rotWithShape="1">
+                    <a:blip r:embed="rId29"/>
+                    <a:srcRect l="-120" r="1" b="-3093"/>
+                    <a:stretch/>
+                  </pic:blipFill>
+                  <pic:spPr bwMode="auto">
+                    <a:xfrm>
+                      <a:off x="0" y="0"/>
+                      <a:ext cx="6002059" cy="3476501"/>
+                    </a:xfrm>
+                    <a:prstGeom prst="rect">
+                      <a:avLst/>
+                    </a:prstGeom>
+                    <a:ln>
+                      <a:noFill/>
+                    </a:ln>
+                    <a:extLst>
+                      <a:ext uri="{53640926-AAD7-44D8-BBD7-CCE9431645EC}">
+                        <a14:shadowObscured xmlns:a14="http://schemas.microsoft.com/office/drawing/2010/main"/>
+                      </a:ext>
+                    </a:extLst>
+                  </pic:spPr>
+                </pic:pic>
+              </a:graphicData>
+            </a:graphic>
+          </wp:inline>
+        </w:drawing>
+      </w:r>
+    </w:p>
+    <w:p>
+      <w:pPr>
+        <w:pStyle w:val="Ttulo1"/>
+        <w:tabs>
+          <w:tab w:val="left" w:pos="1014"/>
+        </w:tabs>
+        <w:spacing w:before="318"/>
+        <w:ind w:firstLine="0"/>
+        <w:rPr>
+          <w:rFonts w:ascii="Century Gothic" w:hAnsi="Century Gothic"/>
+          <w:sz w:val="22"/>
+          <w:szCs w:val="32"/>
+        </w:rPr>
+      </w:pPr>
+    </w:p>
+    <w:p>
+      <w:pPr>
+        <w:pStyle w:val="Ttulo1"/>
+        <w:tabs>
+          <w:tab w:val="left" w:pos="1014"/>
+        </w:tabs>
+        <w:spacing w:before="318"/>
+        <w:ind w:firstLine="0"/>
+        <w:rPr>
+          <w:rFonts w:ascii="Century Gothic" w:hAnsi="Century Gothic"/>
+          <w:sz w:val="22"/>
+          <w:szCs w:val="32"/>
+        </w:rPr>
+      </w:pPr>
+    </w:p>
+    <w:p>
+      <w:pPr>
+        <w:pStyle w:val="Ttulo1"/>
+        <w:tabs>
+          <w:tab w:val="left" w:pos="1014"/>
+        </w:tabs>
+        <w:spacing w:before="318"/>
+        <w:ind w:firstLine="0"/>
+        <w:rPr>
+          <w:rFonts w:ascii="Century Gothic" w:hAnsi="Century Gothic"/>
+          <w:sz w:val="22"/>
+          <w:szCs w:val="32"/>
+        </w:rPr>
+      </w:pPr>
+    </w:p>
+    <w:p>
+      <w:pPr>
+        <w:pStyle w:val="Ttulo1"/>
+        <w:tabs>
+          <w:tab w:val="left" w:pos="1014"/>
+        </w:tabs>
+        <w:spacing w:before="318"/>
+        <w:ind w:firstLine="0"/>
+        <w:rPr>
+          <w:rFonts w:ascii="Century Gothic" w:hAnsi="Century Gothic"/>
+          <w:sz w:val="22"/>
+          <w:szCs w:val="32"/>
+        </w:rPr>
+      </w:pPr>
+    </w:p>
+    <w:p>
+      <w:pPr>
+        <w:pStyle w:val="Ttulo1"/>
+        <w:tabs>
+          <w:tab w:val="left" w:pos="1014"/>
+        </w:tabs>
+        <w:spacing w:before="318"/>
+        <w:ind w:firstLine="0"/>
+        <w:rPr>
+          <w:rFonts w:ascii="Century Gothic" w:hAnsi="Century Gothic"/>
+          <w:sz w:val="22"/>
+          <w:szCs w:val="32"/>
+        </w:rPr>
+      </w:pPr>
+    </w:p>
+    <w:p>
+      <w:pPr>
+        <w:pStyle w:val="Ttulo1"/>
+        <w:tabs>
+          <w:tab w:val="left" w:pos="1014"/>
+        </w:tabs>
+        <w:spacing w:before="318"/>
+        <w:ind w:firstLine="0"/>
+        <w:rPr>
+          <w:rFonts w:ascii="Century Gothic" w:hAnsi="Century Gothic"/>
+          <w:sz w:val="22"/>
+          <w:szCs w:val="32"/>
+        </w:rPr>
+      </w:pPr>
+      <w:r>
+        <w:lastRenderedPageBreak/>
+        <w:drawing>
+          <wp:inline distT="0" distB="0" distL="0" distR="0" wp14:anchorId="4880E6B4" wp14:editId="4103B88C">
+            <wp:extent cx="5956024" cy="3350334"/>
+            <wp:effectExtent l="0" t="0" r="6985" b="2540"/>
+            <wp:docPr id="36" name="Imagen 36"/>
+            <wp:cNvGraphicFramePr>
+              <a:graphicFrameLocks xmlns:a="http://schemas.openxmlformats.org/drawingml/2006/main" noChangeAspect="1"/>
+            </wp:cNvGraphicFramePr>
+            <a:graphic xmlns:a="http://schemas.openxmlformats.org/drawingml/2006/main">
+              <a:graphicData uri="http://schemas.openxmlformats.org/drawingml/2006/picture">
+                <pic:pic xmlns:pic="http://schemas.openxmlformats.org/drawingml/2006/picture">
+                  <pic:nvPicPr>
+                    <pic:cNvPr id="1" name=""/>
+                    <pic:cNvPicPr/>
+                  </pic:nvPicPr>
+                  <pic:blipFill>
+                    <a:blip r:embed="rId30"/>
+                    <a:stretch>
+                      <a:fillRect/>
+                    </a:stretch>
+                  </pic:blipFill>
+                  <pic:spPr>
+                    <a:xfrm>
+                      <a:off x="0" y="0"/>
+                      <a:ext cx="5974537" cy="3360748"/>
+                    </a:xfrm>
+                    <a:prstGeom prst="rect">
+                      <a:avLst/>
+                    </a:prstGeom>
+                  </pic:spPr>
+                </pic:pic>
+              </a:graphicData>
+            </a:graphic>
+          </wp:inline>
+        </w:drawing>
+      </w:r>
+    </w:p>
+    <w:p>
+      <w:pPr>
+        <w:pStyle w:val="Ttulo1"/>
+        <w:tabs>
+          <w:tab w:val="left" w:pos="1014"/>
+        </w:tabs>
+        <w:spacing w:before="318"/>
+        <w:ind w:firstLine="0"/>
+        <w:rPr>
+          <w:rFonts w:ascii="Century Gothic" w:hAnsi="Century Gothic"/>
+          <w:sz w:val="22"/>
+          <w:szCs w:val="32"/>
+        </w:rPr>
+      </w:pPr>
+    </w:p>
+    <w:p>
+      <w:pPr>
+        <w:pStyle w:val="Ttulo1"/>
+        <w:tabs>
+          <w:tab w:val="left" w:pos="1014"/>
+        </w:tabs>
+        <w:spacing w:before="318"/>
+        <w:ind w:firstLine="0"/>
+        <w:rPr>
+          <w:rFonts w:ascii="Century Gothic" w:hAnsi="Century Gothic"/>
+          <w:sz w:val="22"/>
+          <w:szCs w:val="32"/>
+        </w:rPr>
+      </w:pPr>
+    </w:p>
+    <w:p>
+      <w:pPr>
+        <w:pStyle w:val="Ttulo1"/>
+        <w:tabs>
+          <w:tab w:val="left" w:pos="1014"/>
+        </w:tabs>
+        <w:spacing w:before="318"/>
+        <w:ind w:firstLine="0"/>
+        <w:rPr>
+          <w:rFonts w:ascii="Century Gothic" w:hAnsi="Century Gothic"/>
+          <w:sz w:val="22"/>
+          <w:szCs w:val="32"/>
+        </w:rPr>
+      </w:pPr>
+      <w:r>
+        <w:drawing>
+          <wp:inline distT="0" distB="0" distL="0" distR="0" wp14:anchorId="45694416" wp14:editId="269F1A07">
+            <wp:extent cx="6007526" cy="3379305"/>
+            <wp:effectExtent l="0" t="0" r="0" b="0"/>
+            <wp:docPr id="37" name="Imagen 37"/>
+            <wp:cNvGraphicFramePr>
+              <a:graphicFrameLocks xmlns:a="http://schemas.openxmlformats.org/drawingml/2006/main" noChangeAspect="1"/>
+            </wp:cNvGraphicFramePr>
+            <a:graphic xmlns:a="http://schemas.openxmlformats.org/drawingml/2006/main">
+              <a:graphicData uri="http://schemas.openxmlformats.org/drawingml/2006/picture">
+                <pic:pic xmlns:pic="http://schemas.openxmlformats.org/drawingml/2006/picture">
+                  <pic:nvPicPr>
+                    <pic:cNvPr id="1" name=""/>
+                    <pic:cNvPicPr/>
+                  </pic:nvPicPr>
+                  <pic:blipFill>
+                    <a:blip r:embed="rId31"/>
+                    <a:stretch>
+                      <a:fillRect/>
+                    </a:stretch>
+                  </pic:blipFill>
+                  <pic:spPr>
+                    <a:xfrm>
+                      <a:off x="0" y="0"/>
+                      <a:ext cx="6022747" cy="3387867"/>
+                    </a:xfrm>
+                    <a:prstGeom prst="rect">
+                      <a:avLst/>
+                    </a:prstGeom>
+                  </pic:spPr>
+                </pic:pic>
+              </a:graphicData>
+            </a:graphic>
+          </wp:inline>
+        </w:drawing>
+      </w:r>
+    </w:p>
+    <w:p>
+      <w:pPr>
+        <w:pStyle w:val="Ttulo1"/>
+        <w:tabs>
+          <w:tab w:val="left" w:pos="1014"/>
+        </w:tabs>
+        <w:spacing w:before="318"/>
+        <w:ind w:firstLine="0"/>
+        <w:rPr>
+          <w:rFonts w:ascii="Century Gothic" w:hAnsi="Century Gothic"/>
+          <w:sz w:val="22"/>
+          <w:szCs w:val="32"/>
+        </w:rPr>
+      </w:pPr>
+    </w:p>
+    <w:p>
+      <w:pPr>
+        <w:pStyle w:val="Ttulo1"/>
+        <w:tabs>
+          <w:tab w:val="left" w:pos="1014"/>
+        </w:tabs>
+        <w:spacing w:before="318"/>
+        <w:ind w:firstLine="0"/>
+        <w:rPr>
+          <w:rFonts w:ascii="Century Gothic" w:hAnsi="Century Gothic"/>
+          <w:sz w:val="22"/>
+          <w:szCs w:val="32"/>
+        </w:rPr>
+      </w:pPr>
+    </w:p>
+    <w:p>
+      <w:pPr>
+        <w:pStyle w:val="Ttulo1"/>
+        <w:tabs>
+          <w:tab w:val="left" w:pos="1014"/>
+        </w:tabs>
+        <w:spacing w:before="318"/>
+        <w:ind w:firstLine="0"/>
+        <w:rPr>
+          <w:rFonts w:ascii="Century Gothic" w:hAnsi="Century Gothic"/>
+          <w:sz w:val="22"/>
+          <w:szCs w:val="32"/>
+        </w:rPr>
+      </w:pPr>
+    </w:p>
+    <w:p>
+      <w:pPr>
+        <w:pStyle w:val="Ttulo1"/>
+        <w:tabs>
+          <w:tab w:val="left" w:pos="1014"/>
+        </w:tabs>
+        <w:spacing w:before="318"/>
+        <w:ind w:firstLine="0"/>
+        <w:rPr>
+          <w:rFonts w:ascii="Century Gothic" w:hAnsi="Century Gothic"/>
+          <w:sz w:val="22"/>
+          <w:szCs w:val="32"/>
+        </w:rPr>
+      </w:pPr>
+    </w:p>
+    <w:p>
+      <w:pPr>
+        <w:pStyle w:val="Ttulo1"/>
+        <w:tabs>
+          <w:tab w:val="left" w:pos="1014"/>
+        </w:tabs>
+        <w:spacing w:before="318"/>
+        <w:ind w:firstLine="0"/>
+        <w:rPr>
+          <w:rFonts w:ascii="Century Gothic" w:hAnsi="Century Gothic"/>
+          <w:sz w:val="22"/>
+          <w:szCs w:val="32"/>
+        </w:rPr>
+      </w:pPr>
+    </w:p>
+    <w:p>
+      <w:pPr>
+        <w:pStyle w:val="Ttulo1"/>
+        <w:tabs>
+          <w:tab w:val="left" w:pos="1014"/>
+        </w:tabs>
+        <w:spacing w:before="318"/>
+        <w:ind w:firstLine="0"/>
+        <w:rPr>
+          <w:rFonts w:ascii="Century Gothic" w:hAnsi="Century Gothic"/>
+          <w:sz w:val="22"/>
+          <w:szCs w:val="32"/>
+        </w:rPr>
+      </w:pPr>
+    </w:p>
+    <w:p>
+      <w:pPr>
+        <w:pStyle w:val="Ttulo1"/>
+        <w:tabs>
+          <w:tab w:val="left" w:pos="1014"/>
+        </w:tabs>
+        <w:spacing w:before="318"/>
+        <w:ind w:firstLine="0"/>
+        <w:rPr>
+          <w:rFonts w:ascii="Century Gothic" w:hAnsi="Century Gothic"/>
+          <w:sz w:val="22"/>
+          <w:szCs w:val="32"/>
+        </w:rPr>
+      </w:pPr>
+      <w:r>
+        <w:rPr>
+          <w:noProof/>
+        </w:rPr>
+        <w:drawing>
+          <wp:inline distT="0" distB="0" distL="0" distR="0" wp14:anchorId="604BFBEF" wp14:editId="5E1F6A6B">
+            <wp:extent cx="5971430" cy="3359000"/>
+            <wp:effectExtent l="0" t="0" r="0" b="0"/>
+            <wp:docPr id="38" name="Imagen 38"/>
+            <wp:cNvGraphicFramePr>
+              <a:graphicFrameLocks xmlns:a="http://schemas.openxmlformats.org/drawingml/2006/main" noChangeAspect="1"/>
+            </wp:cNvGraphicFramePr>
+            <a:graphic xmlns:a="http://schemas.openxmlformats.org/drawingml/2006/main">
+              <a:graphicData uri="http://schemas.openxmlformats.org/drawingml/2006/picture">
+                <pic:pic xmlns:pic="http://schemas.openxmlformats.org/drawingml/2006/picture">
+                  <pic:nvPicPr>
+                    <pic:cNvPr id="1" name=""/>
+                    <pic:cNvPicPr/>
+                  </pic:nvPicPr>
+                  <pic:blipFill>
+                    <a:blip r:embed="rId32"/>
+                    <a:stretch>
+                      <a:fillRect/>
+                    </a:stretch>
+                  </pic:blipFill>
+                  <pic:spPr>
+                    <a:xfrm>
+                      <a:off x="0" y="0"/>
+                      <a:ext cx="5992540" cy="3370875"/>
+                    </a:xfrm>
+                    <a:prstGeom prst="rect">
+                      <a:avLst/>
+                    </a:prstGeom>
+                  </pic:spPr>
+                </pic:pic>
+              </a:graphicData>
+            </a:graphic>
+          </wp:inline>
+        </w:drawing>
+      </w:r>
+    </w:p>
+    <w:p>
+      <w:pPr>
+        <w:pStyle w:val="Ttulo1"/>
+        <w:tabs>
+          <w:tab w:val="left" w:pos="1014"/>
+        </w:tabs>
+        <w:spacing w:before="318"/>
+        <w:ind w:firstLine="0"/>
+        <w:rPr>
+          <w:rFonts w:ascii="Century Gothic" w:hAnsi="Century Gothic"/>
+          <w:sz w:val="22"/>
+          <w:szCs w:val="32"/>
+        </w:rPr>
+      </w:pPr>
+      <w:r>
+        <w:rPr>
+          <w:noProof/>
+        </w:rPr>
+        <w:drawing>
+          <wp:inline distT="0" distB="0" distL="0" distR="0" wp14:anchorId="67D2723D" wp14:editId="7E750EC4">
+            <wp:extent cx="5995780" cy="3372698"/>
+            <wp:effectExtent l="0" t="0" r="5080" b="0"/>
+            <wp:docPr id="39" name="Imagen 39"/>
+            <wp:cNvGraphicFramePr>
+              <a:graphicFrameLocks xmlns:a="http://schemas.openxmlformats.org/drawingml/2006/main" noChangeAspect="1"/>
+            </wp:cNvGraphicFramePr>
+            <a:graphic xmlns:a="http://schemas.openxmlformats.org/drawingml/2006/main">
+              <a:graphicData uri="http://schemas.openxmlformats.org/drawingml/2006/picture">
+                <pic:pic xmlns:pic="http://schemas.openxmlformats.org/drawingml/2006/picture">
+                  <pic:nvPicPr>
+                    <pic:cNvPr id="1" name=""/>
+                    <pic:cNvPicPr/>
+                  </pic:nvPicPr>
+                  <pic:blipFill>
+                    <a:blip r:embed="rId33"/>
+                    <a:stretch>
+                      <a:fillRect/>
+                    </a:stretch>
+                  </pic:blipFill>
+                  <pic:spPr>
+                    <a:xfrm>
+                      <a:off x="0" y="0"/>
+                      <a:ext cx="6009921" cy="3380653"/>
+                    </a:xfrm>
+                    <a:prstGeom prst="rect">
+                      <a:avLst/>
+                    </a:prstGeom>
+                  </pic:spPr>
+                </pic:pic>
+              </a:graphicData>
+            </a:graphic>
+          </wp:inline>
+        </w:drawing>
+      </w:r>
+    </w:p>
+    <w:p>
+      <w:pPr>
+        <w:pStyle w:val="Ttulo1"/>
+        <w:tabs>
+          <w:tab w:val="left" w:pos="1014"/>
+        </w:tabs>
+        <w:spacing w:before="318"/>
+        <w:ind w:firstLine="0"/>
+        <w:rPr>
+          <w:rFonts w:ascii="Century Gothic" w:hAnsi="Century Gothic"/>
+          <w:sz w:val="22"/>
+          <w:szCs w:val="32"/>
+        </w:rPr>
+      </w:pPr>
+    </w:p>
+    <w:p>
+      <w:pPr>
+        <w:pStyle w:val="Ttulo1"/>
+        <w:tabs>
+          <w:tab w:val="left" w:pos="1014"/>
+        </w:tabs>
+        <w:spacing w:before="318"/>
+        <w:ind w:firstLine="0"/>
+        <w:rPr>
+          <w:rFonts w:ascii="Century Gothic" w:hAnsi="Century Gothic"/>
+          <w:sz w:val="22"/>
+          <w:szCs w:val="32"/>
+        </w:rPr>
+      </w:pPr>
+      <w:r>
+        <w:rPr>
+          <w:rFonts w:ascii="Century Gothic" w:hAnsi="Century Gothic"/>
+          <w:sz w:val="22"/>
+          <w:szCs w:val="32"/>
+        </w:rPr>
+        <w:t xml:space="preserve">Link </w:t>
+      </w:r>
+    </w:p>
+    <w:p>
+      <w:pPr>
+        <w:pStyle w:val="Ttulo1"/>
+        <w:tabs>
+          <w:tab w:val="left" w:pos="1014"/>
+        </w:tabs>
+        <w:spacing w:before="318"/>
+        <w:ind w:firstLine="0"/>
+        <w:rPr>
+          <w:rFonts w:ascii="Century Gothic" w:hAnsi="Century Gothic"/>
+          <w:sz w:val="22"/>
+          <w:szCs w:val="32"/>
+        </w:rPr>
+      </w:pPr>
+      <w:hyperlink r:id="rId34" w:history="1">
+        <w:r>
+          <w:rPr>
+            <w:rStyle w:val="Hipervnculo"/>
+            <w:rFonts w:ascii="Century Gothic" w:hAnsi="Century Gothic"/>
+            <w:sz w:val="22"/>
+            <w:szCs w:val="32"/>
+          </w:rPr>
+          <w:t>https://github.com/macuna6310-lang/ACTIVIDAD1</w:t>
+        </w:r>
+      </w:hyperlink>
+    </w:p>
+    <w:p>
+      <w:pPr>
+        <w:pStyle w:val="Ttulo1"/>
+        <w:tabs>
+          <w:tab w:val="left" w:pos="1014"/>
+        </w:tabs>
+        <w:spacing w:before="318"/>
+        <w:ind w:firstLine="0"/>
+        <w:rPr>
+          <w:rFonts w:ascii="Century Gothic" w:hAnsi="Century Gothic"/>
+          <w:sz w:val="22"/>
+          <w:szCs w:val="32"/>
+        </w:rPr>
+      </w:pPr>
+    </w:p>
     <w:sectPr>
-      <w:footerReference w:type="default" r:id="rId29"/>
+      <w:footerReference w:type="default" r:id="rId35"/>
       <w:pgSz w:w="11910" w:h="16840"/>
       <w:pgMar w:top="1360" w:right="708" w:bottom="280" w:left="708" w:header="0" w:footer="0" w:gutter="0"/>
       <w:cols w:space="720"/>
@@ -12199,6 +12773,29 @@
       <w:lang w:val="es-ES"/>
     </w:rPr>
   </w:style>
+  <w:style w:type="character" w:styleId="Hipervnculo">
+    <w:name w:val="Hyperlink"/>
+    <w:basedOn w:val="Fuentedeprrafopredeter"/>
+    <w:uiPriority w:val="99"/>
+    <w:unhideWhenUsed/>
+    <w:rsid w:val="00007819"/>
+    <w:rPr>
+      <w:color w:val="0000FF" w:themeColor="hyperlink"/>
+      <w:u w:val="single"/>
+    </w:rPr>
+  </w:style>
+  <w:style w:type="character" w:styleId="Mencinsinresolver">
+    <w:name w:val="Unresolved Mention"/>
+    <w:basedOn w:val="Fuentedeprrafopredeter"/>
+    <w:uiPriority w:val="99"/>
+    <w:semiHidden/>
+    <w:unhideWhenUsed/>
+    <w:rsid w:val="00007819"/>
+    <w:rPr>
+      <w:color w:val="605E5C"/>
+      <w:shd w:val="clear" w:color="auto" w:fill="E1DFDD"/>
+    </w:rPr>
+  </w:style>
 </w:styles>
 </file>
 

</xml_diff>